<commit_message>
Add multi-date attendance report API and guides
Introduces an API endpoint for generating complete attendance reports with support for up to 10 date columns. Adds detailed guides for updating Word templates to handle multiple dates, updates attendance symbol documentation, and revises the attendance sheet template for compatibility with the new format.
</commit_message>
<xml_diff>
--- a/public/reports/FM-USTP-ACAD-06-Attendance-and-Punctuality-Monitoring-Sheet.docx
+++ b/public/reports/FM-USTP-ACAD-06-Attendance-and-Punctuality-Monitoring-Sheet.docx
@@ -523,72 +523,188 @@
                 <w:sz w:val="20"/>
                 <w:szCs w:val="20"/>
               </w:rPr>
-              <w:t>{date}</w:t>
+              <w:t>{date</w:t>
             </w:r>
-          </w:p>
-        </w:tc>
-        <w:tc>
-          <w:tcPr>
-            <w:tcW w:w="705" w:type="dxa"/>
-            <w:vAlign w:val="center"/>
-          </w:tcPr>
-          <w:p>
-            <w:pPr>
-              <w:spacing w:after="0" w:line="240" w:lineRule="auto"/>
-              <w:rPr>
-                <w:rFonts w:ascii="Times New Roman" w:eastAsia="Times New Roman" w:hAnsi="Times New Roman" w:cs="Times New Roman"/>
-                <w:sz w:val="20"/>
-                <w:szCs w:val="20"/>
-              </w:rPr>
-            </w:pPr>
-          </w:p>
-        </w:tc>
-        <w:tc>
-          <w:tcPr>
-            <w:tcW w:w="705" w:type="dxa"/>
-            <w:vAlign w:val="center"/>
-          </w:tcPr>
-          <w:p>
-            <w:pPr>
-              <w:spacing w:after="0" w:line="240" w:lineRule="auto"/>
-              <w:rPr>
-                <w:rFonts w:ascii="Times New Roman" w:eastAsia="Times New Roman" w:hAnsi="Times New Roman" w:cs="Times New Roman"/>
-                <w:sz w:val="20"/>
-                <w:szCs w:val="20"/>
-              </w:rPr>
-            </w:pPr>
-          </w:p>
-        </w:tc>
-        <w:tc>
-          <w:tcPr>
-            <w:tcW w:w="705" w:type="dxa"/>
-            <w:vAlign w:val="center"/>
-          </w:tcPr>
-          <w:p>
-            <w:pPr>
-              <w:spacing w:after="0" w:line="240" w:lineRule="auto"/>
-              <w:rPr>
-                <w:rFonts w:ascii="Times New Roman" w:eastAsia="Times New Roman" w:hAnsi="Times New Roman" w:cs="Times New Roman"/>
-                <w:sz w:val="20"/>
-                <w:szCs w:val="20"/>
-              </w:rPr>
-            </w:pPr>
-          </w:p>
-        </w:tc>
-        <w:tc>
-          <w:tcPr>
-            <w:tcW w:w="705" w:type="dxa"/>
-            <w:vAlign w:val="center"/>
-          </w:tcPr>
-          <w:p>
-            <w:pPr>
-              <w:spacing w:after="0" w:line="240" w:lineRule="auto"/>
-              <w:rPr>
-                <w:rFonts w:ascii="Times New Roman" w:eastAsia="Times New Roman" w:hAnsi="Times New Roman" w:cs="Times New Roman"/>
-                <w:sz w:val="20"/>
-                <w:szCs w:val="20"/>
-              </w:rPr>
-            </w:pPr>
+            <w:r>
+              <w:rPr>
+                <w:rFonts w:ascii="Times New Roman" w:eastAsia="Times New Roman" w:hAnsi="Times New Roman" w:cs="Times New Roman"/>
+                <w:sz w:val="20"/>
+                <w:szCs w:val="20"/>
+              </w:rPr>
+              <w:t>1</w:t>
+            </w:r>
+            <w:r>
+              <w:rPr>
+                <w:rFonts w:ascii="Times New Roman" w:eastAsia="Times New Roman" w:hAnsi="Times New Roman" w:cs="Times New Roman"/>
+                <w:sz w:val="20"/>
+                <w:szCs w:val="20"/>
+              </w:rPr>
+              <w:t>}</w:t>
+            </w:r>
+          </w:p>
+        </w:tc>
+        <w:tc>
+          <w:tcPr>
+            <w:tcW w:w="705" w:type="dxa"/>
+            <w:vAlign w:val="center"/>
+          </w:tcPr>
+          <w:p>
+            <w:pPr>
+              <w:spacing w:after="0" w:line="240" w:lineRule="auto"/>
+              <w:jc w:val="center"/>
+              <w:rPr>
+                <w:rFonts w:ascii="Times New Roman" w:eastAsia="Times New Roman" w:hAnsi="Times New Roman" w:cs="Times New Roman"/>
+                <w:sz w:val="20"/>
+                <w:szCs w:val="20"/>
+              </w:rPr>
+            </w:pPr>
+            <w:r>
+              <w:rPr>
+                <w:rFonts w:ascii="Times New Roman" w:eastAsia="Times New Roman" w:hAnsi="Times New Roman" w:cs="Times New Roman"/>
+                <w:sz w:val="20"/>
+                <w:szCs w:val="20"/>
+              </w:rPr>
+              <w:t>{date</w:t>
+            </w:r>
+            <w:r>
+              <w:rPr>
+                <w:rFonts w:ascii="Times New Roman" w:eastAsia="Times New Roman" w:hAnsi="Times New Roman" w:cs="Times New Roman"/>
+                <w:sz w:val="20"/>
+                <w:szCs w:val="20"/>
+              </w:rPr>
+              <w:t>2</w:t>
+            </w:r>
+            <w:r>
+              <w:rPr>
+                <w:rFonts w:ascii="Times New Roman" w:eastAsia="Times New Roman" w:hAnsi="Times New Roman" w:cs="Times New Roman"/>
+                <w:sz w:val="20"/>
+                <w:szCs w:val="20"/>
+              </w:rPr>
+              <w:t>}</w:t>
+            </w:r>
+          </w:p>
+        </w:tc>
+        <w:tc>
+          <w:tcPr>
+            <w:tcW w:w="705" w:type="dxa"/>
+            <w:vAlign w:val="center"/>
+          </w:tcPr>
+          <w:p>
+            <w:pPr>
+              <w:spacing w:after="0" w:line="240" w:lineRule="auto"/>
+              <w:jc w:val="center"/>
+              <w:rPr>
+                <w:rFonts w:ascii="Times New Roman" w:eastAsia="Times New Roman" w:hAnsi="Times New Roman" w:cs="Times New Roman"/>
+                <w:sz w:val="20"/>
+                <w:szCs w:val="20"/>
+              </w:rPr>
+            </w:pPr>
+            <w:r>
+              <w:rPr>
+                <w:rFonts w:ascii="Times New Roman" w:eastAsia="Times New Roman" w:hAnsi="Times New Roman" w:cs="Times New Roman"/>
+                <w:sz w:val="20"/>
+                <w:szCs w:val="20"/>
+              </w:rPr>
+              <w:t>{date</w:t>
+            </w:r>
+            <w:r>
+              <w:rPr>
+                <w:rFonts w:ascii="Times New Roman" w:eastAsia="Times New Roman" w:hAnsi="Times New Roman" w:cs="Times New Roman"/>
+                <w:sz w:val="20"/>
+                <w:szCs w:val="20"/>
+              </w:rPr>
+              <w:t>3</w:t>
+            </w:r>
+            <w:r>
+              <w:rPr>
+                <w:rFonts w:ascii="Times New Roman" w:eastAsia="Times New Roman" w:hAnsi="Times New Roman" w:cs="Times New Roman"/>
+                <w:sz w:val="20"/>
+                <w:szCs w:val="20"/>
+              </w:rPr>
+              <w:t>}</w:t>
+            </w:r>
+          </w:p>
+        </w:tc>
+        <w:tc>
+          <w:tcPr>
+            <w:tcW w:w="705" w:type="dxa"/>
+            <w:vAlign w:val="center"/>
+          </w:tcPr>
+          <w:p>
+            <w:pPr>
+              <w:spacing w:after="0" w:line="240" w:lineRule="auto"/>
+              <w:jc w:val="center"/>
+              <w:rPr>
+                <w:rFonts w:ascii="Times New Roman" w:eastAsia="Times New Roman" w:hAnsi="Times New Roman" w:cs="Times New Roman"/>
+                <w:sz w:val="20"/>
+                <w:szCs w:val="20"/>
+              </w:rPr>
+            </w:pPr>
+            <w:r>
+              <w:rPr>
+                <w:rFonts w:ascii="Times New Roman" w:eastAsia="Times New Roman" w:hAnsi="Times New Roman" w:cs="Times New Roman"/>
+                <w:sz w:val="20"/>
+                <w:szCs w:val="20"/>
+              </w:rPr>
+              <w:t>{date</w:t>
+            </w:r>
+            <w:r>
+              <w:rPr>
+                <w:rFonts w:ascii="Times New Roman" w:eastAsia="Times New Roman" w:hAnsi="Times New Roman" w:cs="Times New Roman"/>
+                <w:sz w:val="20"/>
+                <w:szCs w:val="20"/>
+              </w:rPr>
+              <w:t>4</w:t>
+            </w:r>
+            <w:r>
+              <w:rPr>
+                <w:rFonts w:ascii="Times New Roman" w:eastAsia="Times New Roman" w:hAnsi="Times New Roman" w:cs="Times New Roman"/>
+                <w:sz w:val="20"/>
+                <w:szCs w:val="20"/>
+              </w:rPr>
+              <w:t>}</w:t>
+            </w:r>
+          </w:p>
+        </w:tc>
+        <w:tc>
+          <w:tcPr>
+            <w:tcW w:w="705" w:type="dxa"/>
+            <w:vAlign w:val="center"/>
+          </w:tcPr>
+          <w:p>
+            <w:pPr>
+              <w:spacing w:after="0" w:line="240" w:lineRule="auto"/>
+              <w:jc w:val="center"/>
+              <w:rPr>
+                <w:rFonts w:ascii="Times New Roman" w:eastAsia="Times New Roman" w:hAnsi="Times New Roman" w:cs="Times New Roman"/>
+                <w:sz w:val="20"/>
+                <w:szCs w:val="20"/>
+              </w:rPr>
+            </w:pPr>
+            <w:r>
+              <w:rPr>
+                <w:rFonts w:ascii="Times New Roman" w:eastAsia="Times New Roman" w:hAnsi="Times New Roman" w:cs="Times New Roman"/>
+                <w:sz w:val="20"/>
+                <w:szCs w:val="20"/>
+              </w:rPr>
+              <w:t>{date</w:t>
+            </w:r>
+            <w:r>
+              <w:rPr>
+                <w:rFonts w:ascii="Times New Roman" w:eastAsia="Times New Roman" w:hAnsi="Times New Roman" w:cs="Times New Roman"/>
+                <w:sz w:val="20"/>
+                <w:szCs w:val="20"/>
+              </w:rPr>
+              <w:t>5</w:t>
+            </w:r>
+            <w:r>
+              <w:rPr>
+                <w:rFonts w:ascii="Times New Roman" w:eastAsia="Times New Roman" w:hAnsi="Times New Roman" w:cs="Times New Roman"/>
+                <w:sz w:val="20"/>
+                <w:szCs w:val="20"/>
+              </w:rPr>
+              <w:t>}</w:t>
+            </w:r>
           </w:p>
         </w:tc>
         <w:tc>
@@ -600,76 +716,209 @@
           <w:p>
             <w:pPr>
               <w:spacing w:after="0" w:line="240" w:lineRule="auto"/>
-              <w:rPr>
-                <w:rFonts w:ascii="Times New Roman" w:eastAsia="Times New Roman" w:hAnsi="Times New Roman" w:cs="Times New Roman"/>
-                <w:sz w:val="20"/>
-                <w:szCs w:val="20"/>
-              </w:rPr>
-            </w:pPr>
-          </w:p>
-        </w:tc>
-        <w:tc>
-          <w:tcPr>
-            <w:tcW w:w="705" w:type="dxa"/>
-            <w:vAlign w:val="center"/>
-          </w:tcPr>
-          <w:p>
-            <w:pPr>
-              <w:spacing w:after="0" w:line="240" w:lineRule="auto"/>
-              <w:rPr>
-                <w:rFonts w:ascii="Times New Roman" w:eastAsia="Times New Roman" w:hAnsi="Times New Roman" w:cs="Times New Roman"/>
-                <w:sz w:val="20"/>
-                <w:szCs w:val="20"/>
-              </w:rPr>
-            </w:pPr>
-          </w:p>
-        </w:tc>
-        <w:tc>
-          <w:tcPr>
-            <w:tcW w:w="705" w:type="dxa"/>
-            <w:vAlign w:val="center"/>
-          </w:tcPr>
-          <w:p>
-            <w:pPr>
-              <w:spacing w:after="0" w:line="240" w:lineRule="auto"/>
-              <w:rPr>
-                <w:rFonts w:ascii="Times New Roman" w:eastAsia="Times New Roman" w:hAnsi="Times New Roman" w:cs="Times New Roman"/>
-                <w:sz w:val="20"/>
-                <w:szCs w:val="20"/>
-              </w:rPr>
-            </w:pPr>
-          </w:p>
-        </w:tc>
-        <w:tc>
-          <w:tcPr>
-            <w:tcW w:w="705" w:type="dxa"/>
-            <w:vAlign w:val="center"/>
-          </w:tcPr>
-          <w:p>
-            <w:pPr>
-              <w:spacing w:after="0" w:line="240" w:lineRule="auto"/>
-              <w:rPr>
-                <w:rFonts w:ascii="Times New Roman" w:eastAsia="Times New Roman" w:hAnsi="Times New Roman" w:cs="Times New Roman"/>
-                <w:sz w:val="20"/>
-                <w:szCs w:val="20"/>
-              </w:rPr>
-            </w:pPr>
-          </w:p>
-        </w:tc>
-        <w:tc>
-          <w:tcPr>
-            <w:tcW w:w="705" w:type="dxa"/>
-            <w:vAlign w:val="center"/>
-          </w:tcPr>
-          <w:p>
-            <w:pPr>
-              <w:spacing w:after="0" w:line="240" w:lineRule="auto"/>
-              <w:rPr>
-                <w:rFonts w:ascii="Times New Roman" w:eastAsia="Times New Roman" w:hAnsi="Times New Roman" w:cs="Times New Roman"/>
-                <w:sz w:val="20"/>
-                <w:szCs w:val="20"/>
-              </w:rPr>
-            </w:pPr>
+              <w:jc w:val="center"/>
+              <w:rPr>
+                <w:rFonts w:ascii="Times New Roman" w:eastAsia="Times New Roman" w:hAnsi="Times New Roman" w:cs="Times New Roman"/>
+                <w:sz w:val="20"/>
+                <w:szCs w:val="20"/>
+              </w:rPr>
+            </w:pPr>
+            <w:r>
+              <w:rPr>
+                <w:rFonts w:ascii="Times New Roman" w:eastAsia="Times New Roman" w:hAnsi="Times New Roman" w:cs="Times New Roman"/>
+                <w:sz w:val="20"/>
+                <w:szCs w:val="20"/>
+              </w:rPr>
+              <w:t>{date</w:t>
+            </w:r>
+            <w:r>
+              <w:rPr>
+                <w:rFonts w:ascii="Times New Roman" w:eastAsia="Times New Roman" w:hAnsi="Times New Roman" w:cs="Times New Roman"/>
+                <w:sz w:val="20"/>
+                <w:szCs w:val="20"/>
+              </w:rPr>
+              <w:t>6</w:t>
+            </w:r>
+            <w:r>
+              <w:rPr>
+                <w:rFonts w:ascii="Times New Roman" w:eastAsia="Times New Roman" w:hAnsi="Times New Roman" w:cs="Times New Roman"/>
+                <w:sz w:val="20"/>
+                <w:szCs w:val="20"/>
+              </w:rPr>
+              <w:t>}</w:t>
+            </w:r>
+          </w:p>
+        </w:tc>
+        <w:tc>
+          <w:tcPr>
+            <w:tcW w:w="705" w:type="dxa"/>
+            <w:vAlign w:val="center"/>
+          </w:tcPr>
+          <w:p>
+            <w:pPr>
+              <w:spacing w:after="0" w:line="240" w:lineRule="auto"/>
+              <w:jc w:val="center"/>
+              <w:rPr>
+                <w:rFonts w:ascii="Times New Roman" w:eastAsia="Times New Roman" w:hAnsi="Times New Roman" w:cs="Times New Roman"/>
+                <w:sz w:val="20"/>
+                <w:szCs w:val="20"/>
+              </w:rPr>
+            </w:pPr>
+            <w:r>
+              <w:rPr>
+                <w:rFonts w:ascii="Times New Roman" w:eastAsia="Times New Roman" w:hAnsi="Times New Roman" w:cs="Times New Roman"/>
+                <w:sz w:val="20"/>
+                <w:szCs w:val="20"/>
+              </w:rPr>
+              <w:t>{date</w:t>
+            </w:r>
+            <w:r>
+              <w:rPr>
+                <w:rFonts w:ascii="Times New Roman" w:eastAsia="Times New Roman" w:hAnsi="Times New Roman" w:cs="Times New Roman"/>
+                <w:sz w:val="20"/>
+                <w:szCs w:val="20"/>
+              </w:rPr>
+              <w:t>7</w:t>
+            </w:r>
+            <w:r>
+              <w:rPr>
+                <w:rFonts w:ascii="Times New Roman" w:eastAsia="Times New Roman" w:hAnsi="Times New Roman" w:cs="Times New Roman"/>
+                <w:sz w:val="20"/>
+                <w:szCs w:val="20"/>
+              </w:rPr>
+              <w:t>}</w:t>
+            </w:r>
+          </w:p>
+        </w:tc>
+        <w:tc>
+          <w:tcPr>
+            <w:tcW w:w="705" w:type="dxa"/>
+            <w:vAlign w:val="center"/>
+          </w:tcPr>
+          <w:p>
+            <w:pPr>
+              <w:spacing w:after="0" w:line="240" w:lineRule="auto"/>
+              <w:jc w:val="center"/>
+              <w:rPr>
+                <w:rFonts w:ascii="Times New Roman" w:eastAsia="Times New Roman" w:hAnsi="Times New Roman" w:cs="Times New Roman"/>
+                <w:sz w:val="20"/>
+                <w:szCs w:val="20"/>
+              </w:rPr>
+            </w:pPr>
+            <w:r>
+              <w:rPr>
+                <w:rFonts w:ascii="Times New Roman" w:eastAsia="Times New Roman" w:hAnsi="Times New Roman" w:cs="Times New Roman"/>
+                <w:sz w:val="20"/>
+                <w:szCs w:val="20"/>
+              </w:rPr>
+              <w:t>{date</w:t>
+            </w:r>
+            <w:r>
+              <w:rPr>
+                <w:rFonts w:ascii="Times New Roman" w:eastAsia="Times New Roman" w:hAnsi="Times New Roman" w:cs="Times New Roman"/>
+                <w:sz w:val="20"/>
+                <w:szCs w:val="20"/>
+              </w:rPr>
+              <w:t>8</w:t>
+            </w:r>
+            <w:r>
+              <w:rPr>
+                <w:rFonts w:ascii="Times New Roman" w:eastAsia="Times New Roman" w:hAnsi="Times New Roman" w:cs="Times New Roman"/>
+                <w:sz w:val="20"/>
+                <w:szCs w:val="20"/>
+              </w:rPr>
+              <w:t>}</w:t>
+            </w:r>
+          </w:p>
+        </w:tc>
+        <w:tc>
+          <w:tcPr>
+            <w:tcW w:w="705" w:type="dxa"/>
+            <w:vAlign w:val="center"/>
+          </w:tcPr>
+          <w:p>
+            <w:pPr>
+              <w:spacing w:after="0" w:line="240" w:lineRule="auto"/>
+              <w:jc w:val="center"/>
+              <w:rPr>
+                <w:rFonts w:ascii="Times New Roman" w:eastAsia="Times New Roman" w:hAnsi="Times New Roman" w:cs="Times New Roman"/>
+                <w:sz w:val="20"/>
+                <w:szCs w:val="20"/>
+              </w:rPr>
+            </w:pPr>
+            <w:r>
+              <w:rPr>
+                <w:rFonts w:ascii="Times New Roman" w:eastAsia="Times New Roman" w:hAnsi="Times New Roman" w:cs="Times New Roman"/>
+                <w:sz w:val="20"/>
+                <w:szCs w:val="20"/>
+              </w:rPr>
+              <w:t>{date</w:t>
+            </w:r>
+            <w:r>
+              <w:rPr>
+                <w:rFonts w:ascii="Times New Roman" w:eastAsia="Times New Roman" w:hAnsi="Times New Roman" w:cs="Times New Roman"/>
+                <w:sz w:val="20"/>
+                <w:szCs w:val="20"/>
+              </w:rPr>
+              <w:t>9</w:t>
+            </w:r>
+            <w:r>
+              <w:rPr>
+                <w:rFonts w:ascii="Times New Roman" w:eastAsia="Times New Roman" w:hAnsi="Times New Roman" w:cs="Times New Roman"/>
+                <w:sz w:val="20"/>
+                <w:szCs w:val="20"/>
+              </w:rPr>
+              <w:t>}</w:t>
+            </w:r>
+          </w:p>
+        </w:tc>
+        <w:tc>
+          <w:tcPr>
+            <w:tcW w:w="705" w:type="dxa"/>
+            <w:vAlign w:val="center"/>
+          </w:tcPr>
+          <w:p>
+            <w:pPr>
+              <w:spacing w:after="0" w:line="240" w:lineRule="auto"/>
+              <w:jc w:val="center"/>
+              <w:rPr>
+                <w:rFonts w:ascii="Times New Roman" w:eastAsia="Times New Roman" w:hAnsi="Times New Roman" w:cs="Times New Roman"/>
+                <w:sz w:val="20"/>
+                <w:szCs w:val="20"/>
+              </w:rPr>
+            </w:pPr>
+            <w:r>
+              <w:rPr>
+                <w:rFonts w:ascii="Times New Roman" w:eastAsia="Times New Roman" w:hAnsi="Times New Roman" w:cs="Times New Roman"/>
+                <w:sz w:val="20"/>
+                <w:szCs w:val="20"/>
+              </w:rPr>
+              <w:t>{date</w:t>
+            </w:r>
+            <w:r>
+              <w:rPr>
+                <w:rFonts w:ascii="Times New Roman" w:eastAsia="Times New Roman" w:hAnsi="Times New Roman" w:cs="Times New Roman"/>
+                <w:sz w:val="20"/>
+                <w:szCs w:val="20"/>
+              </w:rPr>
+              <w:t>1</w:t>
+            </w:r>
+            <w:r>
+              <w:rPr>
+                <w:rFonts w:ascii="Times New Roman" w:eastAsia="Times New Roman" w:hAnsi="Times New Roman" w:cs="Times New Roman"/>
+                <w:sz w:val="20"/>
+                <w:szCs w:val="20"/>
+              </w:rPr>
+              <w:t>0</w:t>
+            </w:r>
+            <w:r>
+              <w:rPr>
+                <w:rFonts w:ascii="Times New Roman" w:eastAsia="Times New Roman" w:hAnsi="Times New Roman" w:cs="Times New Roman"/>
+                <w:sz w:val="20"/>
+                <w:szCs w:val="20"/>
+              </w:rPr>
+              <w:t>}</w:t>
+            </w:r>
           </w:p>
         </w:tc>
       </w:tr>
@@ -802,14 +1051,6 @@
                 <w:szCs w:val="20"/>
               </w:rPr>
             </w:pPr>
-            <w:r>
-              <w:rPr>
-                <w:rFonts w:ascii="Times New Roman" w:eastAsia="Times New Roman" w:hAnsi="Times New Roman" w:cs="Times New Roman"/>
-                <w:sz w:val="20"/>
-                <w:szCs w:val="20"/>
-              </w:rPr>
-              <w:t>{attendance}</w:t>
-            </w:r>
           </w:p>
         </w:tc>
         <w:tc>

</xml_diff>

<commit_message>
Add attendance placeholders guide and update template
Added ATTENDANCE_PLACEHOLDERS_GUIDE.md to explain the correct usage of placeholders in the attendance report Word template. Updated FM-USTP-ACAD-06-Attendance-and-Punctuality-Monitoring-Sheet.docx to align with the documented placeholder system for consistent report generation.
</commit_message>
<xml_diff>
--- a/public/reports/FM-USTP-ACAD-06-Attendance-and-Punctuality-Monitoring-Sheet.docx
+++ b/public/reports/FM-USTP-ACAD-06-Attendance-and-Punctuality-Monitoring-Sheet.docx
@@ -367,6 +367,14 @@
                 <w:szCs w:val="20"/>
               </w:rPr>
             </w:pPr>
+            <w:r>
+              <w:rPr>
+                <w:rFonts w:ascii="Times New Roman" w:eastAsia="Times New Roman" w:hAnsi="Times New Roman" w:cs="Times New Roman"/>
+                <w:sz w:val="20"/>
+                <w:szCs w:val="20"/>
+              </w:rPr>
+              <w:t>{#students}</w:t>
+            </w:r>
           </w:p>
         </w:tc>
         <w:tc>
@@ -513,31 +521,31 @@
               <w:jc w:val="center"/>
               <w:rPr>
                 <w:rFonts w:ascii="Times New Roman" w:eastAsia="Times New Roman" w:hAnsi="Times New Roman" w:cs="Times New Roman"/>
-                <w:sz w:val="20"/>
-                <w:szCs w:val="20"/>
+                <w:sz w:val="18"/>
+                <w:szCs w:val="18"/>
               </w:rPr>
             </w:pPr>
             <w:r>
               <w:rPr>
                 <w:rFonts w:ascii="Times New Roman" w:eastAsia="Times New Roman" w:hAnsi="Times New Roman" w:cs="Times New Roman"/>
-                <w:sz w:val="20"/>
-                <w:szCs w:val="20"/>
+                <w:sz w:val="18"/>
+                <w:szCs w:val="18"/>
               </w:rPr>
               <w:t>{date</w:t>
             </w:r>
             <w:r>
               <w:rPr>
                 <w:rFonts w:ascii="Times New Roman" w:eastAsia="Times New Roman" w:hAnsi="Times New Roman" w:cs="Times New Roman"/>
-                <w:sz w:val="20"/>
-                <w:szCs w:val="20"/>
+                <w:sz w:val="18"/>
+                <w:szCs w:val="18"/>
               </w:rPr>
               <w:t>1</w:t>
             </w:r>
             <w:r>
               <w:rPr>
                 <w:rFonts w:ascii="Times New Roman" w:eastAsia="Times New Roman" w:hAnsi="Times New Roman" w:cs="Times New Roman"/>
-                <w:sz w:val="20"/>
-                <w:szCs w:val="20"/>
+                <w:sz w:val="18"/>
+                <w:szCs w:val="18"/>
               </w:rPr>
               <w:t>}</w:t>
             </w:r>
@@ -554,368 +562,232 @@
               <w:jc w:val="center"/>
               <w:rPr>
                 <w:rFonts w:ascii="Times New Roman" w:eastAsia="Times New Roman" w:hAnsi="Times New Roman" w:cs="Times New Roman"/>
-                <w:sz w:val="20"/>
-                <w:szCs w:val="20"/>
+                <w:sz w:val="18"/>
+                <w:szCs w:val="18"/>
               </w:rPr>
             </w:pPr>
             <w:r>
               <w:rPr>
                 <w:rFonts w:ascii="Times New Roman" w:eastAsia="Times New Roman" w:hAnsi="Times New Roman" w:cs="Times New Roman"/>
-                <w:sz w:val="20"/>
-                <w:szCs w:val="20"/>
-              </w:rPr>
-              <w:t>{date</w:t>
+                <w:sz w:val="18"/>
+                <w:szCs w:val="18"/>
+              </w:rPr>
+              <w:t>{date2}</w:t>
+            </w:r>
+          </w:p>
+        </w:tc>
+        <w:tc>
+          <w:tcPr>
+            <w:tcW w:w="705" w:type="dxa"/>
+            <w:vAlign w:val="center"/>
+          </w:tcPr>
+          <w:p>
+            <w:pPr>
+              <w:spacing w:after="0" w:line="240" w:lineRule="auto"/>
+              <w:jc w:val="center"/>
+              <w:rPr>
+                <w:rFonts w:ascii="Times New Roman" w:eastAsia="Times New Roman" w:hAnsi="Times New Roman" w:cs="Times New Roman"/>
+                <w:sz w:val="18"/>
+                <w:szCs w:val="18"/>
+              </w:rPr>
+            </w:pPr>
+            <w:r>
+              <w:rPr>
+                <w:rFonts w:ascii="Times New Roman" w:eastAsia="Times New Roman" w:hAnsi="Times New Roman" w:cs="Times New Roman"/>
+                <w:sz w:val="18"/>
+                <w:szCs w:val="18"/>
+              </w:rPr>
+              <w:t>{date3}</w:t>
+            </w:r>
+          </w:p>
+        </w:tc>
+        <w:tc>
+          <w:tcPr>
+            <w:tcW w:w="705" w:type="dxa"/>
+            <w:vAlign w:val="center"/>
+          </w:tcPr>
+          <w:p>
+            <w:pPr>
+              <w:spacing w:after="0" w:line="240" w:lineRule="auto"/>
+              <w:jc w:val="center"/>
+              <w:rPr>
+                <w:rFonts w:ascii="Times New Roman" w:eastAsia="Times New Roman" w:hAnsi="Times New Roman" w:cs="Times New Roman"/>
+                <w:sz w:val="18"/>
+                <w:szCs w:val="18"/>
+              </w:rPr>
+            </w:pPr>
+            <w:r>
+              <w:rPr>
+                <w:rFonts w:ascii="Times New Roman" w:eastAsia="Times New Roman" w:hAnsi="Times New Roman" w:cs="Times New Roman"/>
+                <w:sz w:val="18"/>
+                <w:szCs w:val="18"/>
+              </w:rPr>
+              <w:t>{date4}</w:t>
+            </w:r>
+          </w:p>
+        </w:tc>
+        <w:tc>
+          <w:tcPr>
+            <w:tcW w:w="705" w:type="dxa"/>
+            <w:vAlign w:val="center"/>
+          </w:tcPr>
+          <w:p>
+            <w:pPr>
+              <w:spacing w:after="0" w:line="240" w:lineRule="auto"/>
+              <w:jc w:val="center"/>
+              <w:rPr>
+                <w:rFonts w:ascii="Times New Roman" w:eastAsia="Times New Roman" w:hAnsi="Times New Roman" w:cs="Times New Roman"/>
+                <w:sz w:val="18"/>
+                <w:szCs w:val="18"/>
+              </w:rPr>
+            </w:pPr>
+            <w:r>
+              <w:rPr>
+                <w:rFonts w:ascii="Times New Roman" w:eastAsia="Times New Roman" w:hAnsi="Times New Roman" w:cs="Times New Roman"/>
+                <w:sz w:val="18"/>
+                <w:szCs w:val="18"/>
+              </w:rPr>
+              <w:t>{date5}</w:t>
+            </w:r>
+          </w:p>
+        </w:tc>
+        <w:tc>
+          <w:tcPr>
+            <w:tcW w:w="780" w:type="dxa"/>
+            <w:gridSpan w:val="2"/>
+            <w:vAlign w:val="center"/>
+          </w:tcPr>
+          <w:p>
+            <w:pPr>
+              <w:spacing w:after="0" w:line="240" w:lineRule="auto"/>
+              <w:jc w:val="center"/>
+              <w:rPr>
+                <w:rFonts w:ascii="Times New Roman" w:eastAsia="Times New Roman" w:hAnsi="Times New Roman" w:cs="Times New Roman"/>
+                <w:sz w:val="18"/>
+                <w:szCs w:val="18"/>
+              </w:rPr>
+            </w:pPr>
+            <w:r>
+              <w:rPr>
+                <w:rFonts w:ascii="Times New Roman" w:eastAsia="Times New Roman" w:hAnsi="Times New Roman" w:cs="Times New Roman"/>
+                <w:sz w:val="18"/>
+                <w:szCs w:val="18"/>
+              </w:rPr>
+              <w:t>{date6}</w:t>
+            </w:r>
+          </w:p>
+        </w:tc>
+        <w:tc>
+          <w:tcPr>
+            <w:tcW w:w="705" w:type="dxa"/>
+            <w:vAlign w:val="center"/>
+          </w:tcPr>
+          <w:p>
+            <w:pPr>
+              <w:spacing w:after="0" w:line="240" w:lineRule="auto"/>
+              <w:jc w:val="center"/>
+              <w:rPr>
+                <w:rFonts w:ascii="Times New Roman" w:eastAsia="Times New Roman" w:hAnsi="Times New Roman" w:cs="Times New Roman"/>
+                <w:sz w:val="18"/>
+                <w:szCs w:val="18"/>
+              </w:rPr>
+            </w:pPr>
+            <w:r>
+              <w:rPr>
+                <w:rFonts w:ascii="Times New Roman" w:eastAsia="Times New Roman" w:hAnsi="Times New Roman" w:cs="Times New Roman"/>
+                <w:sz w:val="18"/>
+                <w:szCs w:val="18"/>
+              </w:rPr>
+              <w:t>{date7}</w:t>
+            </w:r>
+          </w:p>
+        </w:tc>
+        <w:tc>
+          <w:tcPr>
+            <w:tcW w:w="705" w:type="dxa"/>
+            <w:vAlign w:val="center"/>
+          </w:tcPr>
+          <w:p>
+            <w:pPr>
+              <w:spacing w:after="0" w:line="240" w:lineRule="auto"/>
+              <w:jc w:val="center"/>
+              <w:rPr>
+                <w:rFonts w:ascii="Times New Roman" w:eastAsia="Times New Roman" w:hAnsi="Times New Roman" w:cs="Times New Roman"/>
+                <w:sz w:val="18"/>
+                <w:szCs w:val="18"/>
+              </w:rPr>
+            </w:pPr>
+            <w:r>
+              <w:rPr>
+                <w:rFonts w:ascii="Times New Roman" w:eastAsia="Times New Roman" w:hAnsi="Times New Roman" w:cs="Times New Roman"/>
+                <w:sz w:val="18"/>
+                <w:szCs w:val="18"/>
+              </w:rPr>
+              <w:t>{date8}</w:t>
+            </w:r>
+          </w:p>
+        </w:tc>
+        <w:tc>
+          <w:tcPr>
+            <w:tcW w:w="705" w:type="dxa"/>
+            <w:vAlign w:val="center"/>
+          </w:tcPr>
+          <w:p>
+            <w:pPr>
+              <w:spacing w:after="0" w:line="240" w:lineRule="auto"/>
+              <w:jc w:val="center"/>
+              <w:rPr>
+                <w:rFonts w:ascii="Times New Roman" w:eastAsia="Times New Roman" w:hAnsi="Times New Roman" w:cs="Times New Roman"/>
+                <w:sz w:val="18"/>
+                <w:szCs w:val="18"/>
+              </w:rPr>
+            </w:pPr>
+            <w:r>
+              <w:rPr>
+                <w:rFonts w:ascii="Times New Roman" w:eastAsia="Times New Roman" w:hAnsi="Times New Roman" w:cs="Times New Roman"/>
+                <w:sz w:val="18"/>
+                <w:szCs w:val="18"/>
+              </w:rPr>
+              <w:t>{date9}</w:t>
+            </w:r>
+          </w:p>
+        </w:tc>
+        <w:tc>
+          <w:tcPr>
+            <w:tcW w:w="705" w:type="dxa"/>
+            <w:vAlign w:val="center"/>
+          </w:tcPr>
+          <w:p>
+            <w:pPr>
+              <w:spacing w:after="0" w:line="240" w:lineRule="auto"/>
+              <w:jc w:val="center"/>
+              <w:rPr>
+                <w:rFonts w:ascii="Times New Roman" w:eastAsia="Times New Roman" w:hAnsi="Times New Roman" w:cs="Times New Roman"/>
+                <w:sz w:val="18"/>
+                <w:szCs w:val="18"/>
+              </w:rPr>
+            </w:pPr>
+            <w:r>
+              <w:rPr>
+                <w:rFonts w:ascii="Times New Roman" w:eastAsia="Times New Roman" w:hAnsi="Times New Roman" w:cs="Times New Roman"/>
+                <w:sz w:val="18"/>
+                <w:szCs w:val="18"/>
+              </w:rPr>
+              <w:t>{date1</w:t>
             </w:r>
             <w:r>
               <w:rPr>
                 <w:rFonts w:ascii="Times New Roman" w:eastAsia="Times New Roman" w:hAnsi="Times New Roman" w:cs="Times New Roman"/>
-                <w:sz w:val="20"/>
-                <w:szCs w:val="20"/>
-              </w:rPr>
-              <w:t>2</w:t>
-            </w:r>
-            <w:r>
-              <w:rPr>
-                <w:rFonts w:ascii="Times New Roman" w:eastAsia="Times New Roman" w:hAnsi="Times New Roman" w:cs="Times New Roman"/>
-                <w:sz w:val="20"/>
-                <w:szCs w:val="20"/>
-              </w:rPr>
-              <w:t>}</w:t>
-            </w:r>
-          </w:p>
-        </w:tc>
-        <w:tc>
-          <w:tcPr>
-            <w:tcW w:w="705" w:type="dxa"/>
-            <w:vAlign w:val="center"/>
-          </w:tcPr>
-          <w:p>
-            <w:pPr>
-              <w:spacing w:after="0" w:line="240" w:lineRule="auto"/>
-              <w:jc w:val="center"/>
-              <w:rPr>
-                <w:rFonts w:ascii="Times New Roman" w:eastAsia="Times New Roman" w:hAnsi="Times New Roman" w:cs="Times New Roman"/>
-                <w:sz w:val="20"/>
-                <w:szCs w:val="20"/>
-              </w:rPr>
-            </w:pPr>
-            <w:r>
-              <w:rPr>
-                <w:rFonts w:ascii="Times New Roman" w:eastAsia="Times New Roman" w:hAnsi="Times New Roman" w:cs="Times New Roman"/>
-                <w:sz w:val="20"/>
-                <w:szCs w:val="20"/>
-              </w:rPr>
-              <w:t>{date</w:t>
-            </w:r>
-            <w:r>
-              <w:rPr>
-                <w:rFonts w:ascii="Times New Roman" w:eastAsia="Times New Roman" w:hAnsi="Times New Roman" w:cs="Times New Roman"/>
-                <w:sz w:val="20"/>
-                <w:szCs w:val="20"/>
-              </w:rPr>
-              <w:t>3</w:t>
-            </w:r>
-            <w:r>
-              <w:rPr>
-                <w:rFonts w:ascii="Times New Roman" w:eastAsia="Times New Roman" w:hAnsi="Times New Roman" w:cs="Times New Roman"/>
-                <w:sz w:val="20"/>
-                <w:szCs w:val="20"/>
-              </w:rPr>
-              <w:t>}</w:t>
-            </w:r>
-          </w:p>
-        </w:tc>
-        <w:tc>
-          <w:tcPr>
-            <w:tcW w:w="705" w:type="dxa"/>
-            <w:vAlign w:val="center"/>
-          </w:tcPr>
-          <w:p>
-            <w:pPr>
-              <w:spacing w:after="0" w:line="240" w:lineRule="auto"/>
-              <w:jc w:val="center"/>
-              <w:rPr>
-                <w:rFonts w:ascii="Times New Roman" w:eastAsia="Times New Roman" w:hAnsi="Times New Roman" w:cs="Times New Roman"/>
-                <w:sz w:val="20"/>
-                <w:szCs w:val="20"/>
-              </w:rPr>
-            </w:pPr>
-            <w:r>
-              <w:rPr>
-                <w:rFonts w:ascii="Times New Roman" w:eastAsia="Times New Roman" w:hAnsi="Times New Roman" w:cs="Times New Roman"/>
-                <w:sz w:val="20"/>
-                <w:szCs w:val="20"/>
-              </w:rPr>
-              <w:t>{date</w:t>
-            </w:r>
-            <w:r>
-              <w:rPr>
-                <w:rFonts w:ascii="Times New Roman" w:eastAsia="Times New Roman" w:hAnsi="Times New Roman" w:cs="Times New Roman"/>
-                <w:sz w:val="20"/>
-                <w:szCs w:val="20"/>
-              </w:rPr>
-              <w:t>4</w:t>
-            </w:r>
-            <w:r>
-              <w:rPr>
-                <w:rFonts w:ascii="Times New Roman" w:eastAsia="Times New Roman" w:hAnsi="Times New Roman" w:cs="Times New Roman"/>
-                <w:sz w:val="20"/>
-                <w:szCs w:val="20"/>
-              </w:rPr>
-              <w:t>}</w:t>
-            </w:r>
-          </w:p>
-        </w:tc>
-        <w:tc>
-          <w:tcPr>
-            <w:tcW w:w="705" w:type="dxa"/>
-            <w:vAlign w:val="center"/>
-          </w:tcPr>
-          <w:p>
-            <w:pPr>
-              <w:spacing w:after="0" w:line="240" w:lineRule="auto"/>
-              <w:jc w:val="center"/>
-              <w:rPr>
-                <w:rFonts w:ascii="Times New Roman" w:eastAsia="Times New Roman" w:hAnsi="Times New Roman" w:cs="Times New Roman"/>
-                <w:sz w:val="20"/>
-                <w:szCs w:val="20"/>
-              </w:rPr>
-            </w:pPr>
-            <w:r>
-              <w:rPr>
-                <w:rFonts w:ascii="Times New Roman" w:eastAsia="Times New Roman" w:hAnsi="Times New Roman" w:cs="Times New Roman"/>
-                <w:sz w:val="20"/>
-                <w:szCs w:val="20"/>
-              </w:rPr>
-              <w:t>{date</w:t>
-            </w:r>
-            <w:r>
-              <w:rPr>
-                <w:rFonts w:ascii="Times New Roman" w:eastAsia="Times New Roman" w:hAnsi="Times New Roman" w:cs="Times New Roman"/>
-                <w:sz w:val="20"/>
-                <w:szCs w:val="20"/>
-              </w:rPr>
-              <w:t>5</w:t>
-            </w:r>
-            <w:r>
-              <w:rPr>
-                <w:rFonts w:ascii="Times New Roman" w:eastAsia="Times New Roman" w:hAnsi="Times New Roman" w:cs="Times New Roman"/>
-                <w:sz w:val="20"/>
-                <w:szCs w:val="20"/>
-              </w:rPr>
-              <w:t>}</w:t>
-            </w:r>
-          </w:p>
-        </w:tc>
-        <w:tc>
-          <w:tcPr>
-            <w:tcW w:w="780" w:type="dxa"/>
-            <w:gridSpan w:val="2"/>
-            <w:vAlign w:val="center"/>
-          </w:tcPr>
-          <w:p>
-            <w:pPr>
-              <w:spacing w:after="0" w:line="240" w:lineRule="auto"/>
-              <w:jc w:val="center"/>
-              <w:rPr>
-                <w:rFonts w:ascii="Times New Roman" w:eastAsia="Times New Roman" w:hAnsi="Times New Roman" w:cs="Times New Roman"/>
-                <w:sz w:val="20"/>
-                <w:szCs w:val="20"/>
-              </w:rPr>
-            </w:pPr>
-            <w:r>
-              <w:rPr>
-                <w:rFonts w:ascii="Times New Roman" w:eastAsia="Times New Roman" w:hAnsi="Times New Roman" w:cs="Times New Roman"/>
-                <w:sz w:val="20"/>
-                <w:szCs w:val="20"/>
-              </w:rPr>
-              <w:t>{date</w:t>
-            </w:r>
-            <w:r>
-              <w:rPr>
-                <w:rFonts w:ascii="Times New Roman" w:eastAsia="Times New Roman" w:hAnsi="Times New Roman" w:cs="Times New Roman"/>
-                <w:sz w:val="20"/>
-                <w:szCs w:val="20"/>
-              </w:rPr>
-              <w:t>6</w:t>
-            </w:r>
-            <w:r>
-              <w:rPr>
-                <w:rFonts w:ascii="Times New Roman" w:eastAsia="Times New Roman" w:hAnsi="Times New Roman" w:cs="Times New Roman"/>
-                <w:sz w:val="20"/>
-                <w:szCs w:val="20"/>
-              </w:rPr>
-              <w:t>}</w:t>
-            </w:r>
-          </w:p>
-        </w:tc>
-        <w:tc>
-          <w:tcPr>
-            <w:tcW w:w="705" w:type="dxa"/>
-            <w:vAlign w:val="center"/>
-          </w:tcPr>
-          <w:p>
-            <w:pPr>
-              <w:spacing w:after="0" w:line="240" w:lineRule="auto"/>
-              <w:jc w:val="center"/>
-              <w:rPr>
-                <w:rFonts w:ascii="Times New Roman" w:eastAsia="Times New Roman" w:hAnsi="Times New Roman" w:cs="Times New Roman"/>
-                <w:sz w:val="20"/>
-                <w:szCs w:val="20"/>
-              </w:rPr>
-            </w:pPr>
-            <w:r>
-              <w:rPr>
-                <w:rFonts w:ascii="Times New Roman" w:eastAsia="Times New Roman" w:hAnsi="Times New Roman" w:cs="Times New Roman"/>
-                <w:sz w:val="20"/>
-                <w:szCs w:val="20"/>
-              </w:rPr>
-              <w:t>{date</w:t>
-            </w:r>
-            <w:r>
-              <w:rPr>
-                <w:rFonts w:ascii="Times New Roman" w:eastAsia="Times New Roman" w:hAnsi="Times New Roman" w:cs="Times New Roman"/>
-                <w:sz w:val="20"/>
-                <w:szCs w:val="20"/>
-              </w:rPr>
-              <w:t>7</w:t>
-            </w:r>
-            <w:r>
-              <w:rPr>
-                <w:rFonts w:ascii="Times New Roman" w:eastAsia="Times New Roman" w:hAnsi="Times New Roman" w:cs="Times New Roman"/>
-                <w:sz w:val="20"/>
-                <w:szCs w:val="20"/>
-              </w:rPr>
-              <w:t>}</w:t>
-            </w:r>
-          </w:p>
-        </w:tc>
-        <w:tc>
-          <w:tcPr>
-            <w:tcW w:w="705" w:type="dxa"/>
-            <w:vAlign w:val="center"/>
-          </w:tcPr>
-          <w:p>
-            <w:pPr>
-              <w:spacing w:after="0" w:line="240" w:lineRule="auto"/>
-              <w:jc w:val="center"/>
-              <w:rPr>
-                <w:rFonts w:ascii="Times New Roman" w:eastAsia="Times New Roman" w:hAnsi="Times New Roman" w:cs="Times New Roman"/>
-                <w:sz w:val="20"/>
-                <w:szCs w:val="20"/>
-              </w:rPr>
-            </w:pPr>
-            <w:r>
-              <w:rPr>
-                <w:rFonts w:ascii="Times New Roman" w:eastAsia="Times New Roman" w:hAnsi="Times New Roman" w:cs="Times New Roman"/>
-                <w:sz w:val="20"/>
-                <w:szCs w:val="20"/>
-              </w:rPr>
-              <w:t>{date</w:t>
-            </w:r>
-            <w:r>
-              <w:rPr>
-                <w:rFonts w:ascii="Times New Roman" w:eastAsia="Times New Roman" w:hAnsi="Times New Roman" w:cs="Times New Roman"/>
-                <w:sz w:val="20"/>
-                <w:szCs w:val="20"/>
-              </w:rPr>
-              <w:t>8</w:t>
-            </w:r>
-            <w:r>
-              <w:rPr>
-                <w:rFonts w:ascii="Times New Roman" w:eastAsia="Times New Roman" w:hAnsi="Times New Roman" w:cs="Times New Roman"/>
-                <w:sz w:val="20"/>
-                <w:szCs w:val="20"/>
-              </w:rPr>
-              <w:t>}</w:t>
-            </w:r>
-          </w:p>
-        </w:tc>
-        <w:tc>
-          <w:tcPr>
-            <w:tcW w:w="705" w:type="dxa"/>
-            <w:vAlign w:val="center"/>
-          </w:tcPr>
-          <w:p>
-            <w:pPr>
-              <w:spacing w:after="0" w:line="240" w:lineRule="auto"/>
-              <w:jc w:val="center"/>
-              <w:rPr>
-                <w:rFonts w:ascii="Times New Roman" w:eastAsia="Times New Roman" w:hAnsi="Times New Roman" w:cs="Times New Roman"/>
-                <w:sz w:val="20"/>
-                <w:szCs w:val="20"/>
-              </w:rPr>
-            </w:pPr>
-            <w:r>
-              <w:rPr>
-                <w:rFonts w:ascii="Times New Roman" w:eastAsia="Times New Roman" w:hAnsi="Times New Roman" w:cs="Times New Roman"/>
-                <w:sz w:val="20"/>
-                <w:szCs w:val="20"/>
-              </w:rPr>
-              <w:t>{date</w:t>
-            </w:r>
-            <w:r>
-              <w:rPr>
-                <w:rFonts w:ascii="Times New Roman" w:eastAsia="Times New Roman" w:hAnsi="Times New Roman" w:cs="Times New Roman"/>
-                <w:sz w:val="20"/>
-                <w:szCs w:val="20"/>
-              </w:rPr>
-              <w:t>9</w:t>
-            </w:r>
-            <w:r>
-              <w:rPr>
-                <w:rFonts w:ascii="Times New Roman" w:eastAsia="Times New Roman" w:hAnsi="Times New Roman" w:cs="Times New Roman"/>
-                <w:sz w:val="20"/>
-                <w:szCs w:val="20"/>
-              </w:rPr>
-              <w:t>}</w:t>
-            </w:r>
-          </w:p>
-        </w:tc>
-        <w:tc>
-          <w:tcPr>
-            <w:tcW w:w="705" w:type="dxa"/>
-            <w:vAlign w:val="center"/>
-          </w:tcPr>
-          <w:p>
-            <w:pPr>
-              <w:spacing w:after="0" w:line="240" w:lineRule="auto"/>
-              <w:jc w:val="center"/>
-              <w:rPr>
-                <w:rFonts w:ascii="Times New Roman" w:eastAsia="Times New Roman" w:hAnsi="Times New Roman" w:cs="Times New Roman"/>
-                <w:sz w:val="20"/>
-                <w:szCs w:val="20"/>
-              </w:rPr>
-            </w:pPr>
-            <w:r>
-              <w:rPr>
-                <w:rFonts w:ascii="Times New Roman" w:eastAsia="Times New Roman" w:hAnsi="Times New Roman" w:cs="Times New Roman"/>
-                <w:sz w:val="20"/>
-                <w:szCs w:val="20"/>
-              </w:rPr>
-              <w:t>{date</w:t>
-            </w:r>
-            <w:r>
-              <w:rPr>
-                <w:rFonts w:ascii="Times New Roman" w:eastAsia="Times New Roman" w:hAnsi="Times New Roman" w:cs="Times New Roman"/>
-                <w:sz w:val="20"/>
-                <w:szCs w:val="20"/>
-              </w:rPr>
-              <w:t>1</w:t>
-            </w:r>
-            <w:r>
-              <w:rPr>
-                <w:rFonts w:ascii="Times New Roman" w:eastAsia="Times New Roman" w:hAnsi="Times New Roman" w:cs="Times New Roman"/>
-                <w:sz w:val="20"/>
-                <w:szCs w:val="20"/>
+                <w:sz w:val="18"/>
+                <w:szCs w:val="18"/>
               </w:rPr>
               <w:t>0</w:t>
             </w:r>
             <w:r>
               <w:rPr>
                 <w:rFonts w:ascii="Times New Roman" w:eastAsia="Times New Roman" w:hAnsi="Times New Roman" w:cs="Times New Roman"/>
-                <w:sz w:val="20"/>
-                <w:szCs w:val="20"/>
+                <w:sz w:val="18"/>
+                <w:szCs w:val="18"/>
               </w:rPr>
               <w:t>}</w:t>
             </w:r>
@@ -980,7 +852,7 @@
                 <w:sz w:val="20"/>
                 <w:szCs w:val="20"/>
               </w:rPr>
-              <w:t>{name}</w:t>
+              <w:t>{name</w:t>
             </w:r>
             <w:r>
               <w:rPr>
@@ -988,7 +860,7 @@
                 <w:sz w:val="20"/>
                 <w:szCs w:val="20"/>
               </w:rPr>
-              <w:t>{#students}</w:t>
+              <w:t>}</w:t>
             </w:r>
           </w:p>
         </w:tc>

</xml_diff>

<commit_message>
Update attendance placeholders to use attendance1, attendance2, etc.
Revised documentation and template guides to clarify that student attendance symbols should use {attendance1}, {attendance2}, etc. instead of {date1}, {date2}, etc. Updated API code to generate attendance keys accordingly and changed date formatting to mm/dd/yy. Updated the Word template to match the new placeholder convention.
</commit_message>
<xml_diff>
--- a/public/reports/FM-USTP-ACAD-06-Attendance-and-Punctuality-Monitoring-Sheet.docx
+++ b/public/reports/FM-USTP-ACAD-06-Attendance-and-Punctuality-Monitoring-Sheet.docx
@@ -367,14 +367,6 @@
                 <w:szCs w:val="20"/>
               </w:rPr>
             </w:pPr>
-            <w:r>
-              <w:rPr>
-                <w:rFonts w:ascii="Times New Roman" w:eastAsia="Times New Roman" w:hAnsi="Times New Roman" w:cs="Times New Roman"/>
-                <w:sz w:val="20"/>
-                <w:szCs w:val="20"/>
-              </w:rPr>
-              <w:t>{#students}</w:t>
-            </w:r>
           </w:p>
         </w:tc>
         <w:tc>
@@ -844,7 +836,7 @@
                 <w:sz w:val="20"/>
                 <w:szCs w:val="20"/>
               </w:rPr>
-              <w:t xml:space="preserve"> </w:t>
+              <w:t xml:space="preserve"> {name}</w:t>
             </w:r>
             <w:r>
               <w:rPr>
@@ -852,15 +844,7 @@
                 <w:sz w:val="20"/>
                 <w:szCs w:val="20"/>
               </w:rPr>
-              <w:t>{name</w:t>
-            </w:r>
-            <w:r>
-              <w:rPr>
-                <w:rFonts w:ascii="Times New Roman" w:eastAsia="Times New Roman" w:hAnsi="Times New Roman" w:cs="Times New Roman"/>
-                <w:sz w:val="20"/>
-                <w:szCs w:val="20"/>
-              </w:rPr>
-              <w:t>}</w:t>
+              <w:t>{#students}</w:t>
             </w:r>
           </w:p>
         </w:tc>
@@ -923,70 +907,178 @@
                 <w:szCs w:val="20"/>
               </w:rPr>
             </w:pPr>
-          </w:p>
-        </w:tc>
-        <w:tc>
-          <w:tcPr>
-            <w:tcW w:w="705" w:type="dxa"/>
-            <w:vAlign w:val="center"/>
-          </w:tcPr>
-          <w:p>
-            <w:pPr>
-              <w:spacing w:after="0" w:line="240" w:lineRule="auto"/>
-              <w:rPr>
-                <w:rFonts w:ascii="Times New Roman" w:eastAsia="Times New Roman" w:hAnsi="Times New Roman" w:cs="Times New Roman"/>
-                <w:sz w:val="20"/>
-                <w:szCs w:val="20"/>
-              </w:rPr>
-            </w:pPr>
-          </w:p>
-        </w:tc>
-        <w:tc>
-          <w:tcPr>
-            <w:tcW w:w="705" w:type="dxa"/>
-            <w:vAlign w:val="center"/>
-          </w:tcPr>
-          <w:p>
-            <w:pPr>
-              <w:spacing w:after="0" w:line="240" w:lineRule="auto"/>
-              <w:rPr>
-                <w:rFonts w:ascii="Times New Roman" w:eastAsia="Times New Roman" w:hAnsi="Times New Roman" w:cs="Times New Roman"/>
-                <w:sz w:val="20"/>
-                <w:szCs w:val="20"/>
-              </w:rPr>
-            </w:pPr>
-          </w:p>
-        </w:tc>
-        <w:tc>
-          <w:tcPr>
-            <w:tcW w:w="705" w:type="dxa"/>
-            <w:vAlign w:val="center"/>
-          </w:tcPr>
-          <w:p>
-            <w:pPr>
-              <w:spacing w:after="0" w:line="240" w:lineRule="auto"/>
-              <w:rPr>
-                <w:rFonts w:ascii="Times New Roman" w:eastAsia="Times New Roman" w:hAnsi="Times New Roman" w:cs="Times New Roman"/>
-                <w:sz w:val="20"/>
-                <w:szCs w:val="20"/>
-              </w:rPr>
-            </w:pPr>
-          </w:p>
-        </w:tc>
-        <w:tc>
-          <w:tcPr>
-            <w:tcW w:w="705" w:type="dxa"/>
-            <w:vAlign w:val="center"/>
-          </w:tcPr>
-          <w:p>
-            <w:pPr>
-              <w:spacing w:after="0" w:line="240" w:lineRule="auto"/>
-              <w:rPr>
-                <w:rFonts w:ascii="Times New Roman" w:eastAsia="Times New Roman" w:hAnsi="Times New Roman" w:cs="Times New Roman"/>
-                <w:sz w:val="20"/>
-                <w:szCs w:val="20"/>
-              </w:rPr>
-            </w:pPr>
+            <w:r>
+              <w:rPr>
+                <w:rFonts w:ascii="Times New Roman" w:eastAsia="Times New Roman" w:hAnsi="Times New Roman" w:cs="Times New Roman"/>
+                <w:sz w:val="20"/>
+                <w:szCs w:val="20"/>
+              </w:rPr>
+              <w:t>{attendance1}</w:t>
+            </w:r>
+          </w:p>
+        </w:tc>
+        <w:tc>
+          <w:tcPr>
+            <w:tcW w:w="705" w:type="dxa"/>
+            <w:vAlign w:val="center"/>
+          </w:tcPr>
+          <w:p>
+            <w:pPr>
+              <w:spacing w:after="0" w:line="240" w:lineRule="auto"/>
+              <w:jc w:val="center"/>
+              <w:rPr>
+                <w:rFonts w:ascii="Times New Roman" w:eastAsia="Times New Roman" w:hAnsi="Times New Roman" w:cs="Times New Roman"/>
+                <w:sz w:val="20"/>
+                <w:szCs w:val="20"/>
+              </w:rPr>
+            </w:pPr>
+            <w:r>
+              <w:rPr>
+                <w:rFonts w:ascii="Times New Roman" w:eastAsia="Times New Roman" w:hAnsi="Times New Roman" w:cs="Times New Roman"/>
+                <w:sz w:val="20"/>
+                <w:szCs w:val="20"/>
+              </w:rPr>
+              <w:t>{attendance</w:t>
+            </w:r>
+            <w:r>
+              <w:rPr>
+                <w:rFonts w:ascii="Times New Roman" w:eastAsia="Times New Roman" w:hAnsi="Times New Roman" w:cs="Times New Roman"/>
+                <w:sz w:val="20"/>
+                <w:szCs w:val="20"/>
+              </w:rPr>
+              <w:t>2</w:t>
+            </w:r>
+            <w:r>
+              <w:rPr>
+                <w:rFonts w:ascii="Times New Roman" w:eastAsia="Times New Roman" w:hAnsi="Times New Roman" w:cs="Times New Roman"/>
+                <w:sz w:val="20"/>
+                <w:szCs w:val="20"/>
+              </w:rPr>
+              <w:t>}</w:t>
+            </w:r>
+          </w:p>
+        </w:tc>
+        <w:tc>
+          <w:tcPr>
+            <w:tcW w:w="705" w:type="dxa"/>
+            <w:vAlign w:val="center"/>
+          </w:tcPr>
+          <w:p>
+            <w:pPr>
+              <w:spacing w:after="0" w:line="240" w:lineRule="auto"/>
+              <w:jc w:val="center"/>
+              <w:rPr>
+                <w:rFonts w:ascii="Times New Roman" w:eastAsia="Times New Roman" w:hAnsi="Times New Roman" w:cs="Times New Roman"/>
+                <w:sz w:val="20"/>
+                <w:szCs w:val="20"/>
+              </w:rPr>
+            </w:pPr>
+            <w:r>
+              <w:rPr>
+                <w:rFonts w:ascii="Times New Roman" w:eastAsia="Times New Roman" w:hAnsi="Times New Roman" w:cs="Times New Roman"/>
+                <w:sz w:val="20"/>
+                <w:szCs w:val="20"/>
+              </w:rPr>
+              <w:t>{attendance</w:t>
+            </w:r>
+            <w:r>
+              <w:rPr>
+                <w:rFonts w:ascii="Times New Roman" w:eastAsia="Times New Roman" w:hAnsi="Times New Roman" w:cs="Times New Roman"/>
+                <w:sz w:val="20"/>
+                <w:szCs w:val="20"/>
+              </w:rPr>
+              <w:t>3</w:t>
+            </w:r>
+            <w:r>
+              <w:rPr>
+                <w:rFonts w:ascii="Times New Roman" w:eastAsia="Times New Roman" w:hAnsi="Times New Roman" w:cs="Times New Roman"/>
+                <w:sz w:val="20"/>
+                <w:szCs w:val="20"/>
+              </w:rPr>
+              <w:t>}</w:t>
+            </w:r>
+          </w:p>
+        </w:tc>
+        <w:tc>
+          <w:tcPr>
+            <w:tcW w:w="705" w:type="dxa"/>
+            <w:vAlign w:val="center"/>
+          </w:tcPr>
+          <w:p>
+            <w:pPr>
+              <w:spacing w:after="0" w:line="240" w:lineRule="auto"/>
+              <w:jc w:val="center"/>
+              <w:rPr>
+                <w:rFonts w:ascii="Times New Roman" w:eastAsia="Times New Roman" w:hAnsi="Times New Roman" w:cs="Times New Roman"/>
+                <w:sz w:val="20"/>
+                <w:szCs w:val="20"/>
+              </w:rPr>
+            </w:pPr>
+            <w:r>
+              <w:rPr>
+                <w:rFonts w:ascii="Times New Roman" w:eastAsia="Times New Roman" w:hAnsi="Times New Roman" w:cs="Times New Roman"/>
+                <w:sz w:val="20"/>
+                <w:szCs w:val="20"/>
+              </w:rPr>
+              <w:t>{attendance</w:t>
+            </w:r>
+            <w:r>
+              <w:rPr>
+                <w:rFonts w:ascii="Times New Roman" w:eastAsia="Times New Roman" w:hAnsi="Times New Roman" w:cs="Times New Roman"/>
+                <w:sz w:val="20"/>
+                <w:szCs w:val="20"/>
+              </w:rPr>
+              <w:t>4</w:t>
+            </w:r>
+            <w:r>
+              <w:rPr>
+                <w:rFonts w:ascii="Times New Roman" w:eastAsia="Times New Roman" w:hAnsi="Times New Roman" w:cs="Times New Roman"/>
+                <w:sz w:val="20"/>
+                <w:szCs w:val="20"/>
+              </w:rPr>
+              <w:t>}</w:t>
+            </w:r>
+          </w:p>
+        </w:tc>
+        <w:tc>
+          <w:tcPr>
+            <w:tcW w:w="705" w:type="dxa"/>
+            <w:vAlign w:val="center"/>
+          </w:tcPr>
+          <w:p>
+            <w:pPr>
+              <w:spacing w:after="0" w:line="240" w:lineRule="auto"/>
+              <w:jc w:val="center"/>
+              <w:rPr>
+                <w:rFonts w:ascii="Times New Roman" w:eastAsia="Times New Roman" w:hAnsi="Times New Roman" w:cs="Times New Roman"/>
+                <w:sz w:val="20"/>
+                <w:szCs w:val="20"/>
+              </w:rPr>
+            </w:pPr>
+            <w:r>
+              <w:rPr>
+                <w:rFonts w:ascii="Times New Roman" w:eastAsia="Times New Roman" w:hAnsi="Times New Roman" w:cs="Times New Roman"/>
+                <w:sz w:val="20"/>
+                <w:szCs w:val="20"/>
+              </w:rPr>
+              <w:t>{attendance</w:t>
+            </w:r>
+            <w:r>
+              <w:rPr>
+                <w:rFonts w:ascii="Times New Roman" w:eastAsia="Times New Roman" w:hAnsi="Times New Roman" w:cs="Times New Roman"/>
+                <w:sz w:val="20"/>
+                <w:szCs w:val="20"/>
+              </w:rPr>
+              <w:t>5</w:t>
+            </w:r>
+            <w:r>
+              <w:rPr>
+                <w:rFonts w:ascii="Times New Roman" w:eastAsia="Times New Roman" w:hAnsi="Times New Roman" w:cs="Times New Roman"/>
+                <w:sz w:val="20"/>
+                <w:szCs w:val="20"/>
+              </w:rPr>
+              <w:t>}</w:t>
+            </w:r>
           </w:p>
         </w:tc>
         <w:tc>
@@ -998,70 +1090,7 @@
           <w:p>
             <w:pPr>
               <w:spacing w:after="0" w:line="240" w:lineRule="auto"/>
-              <w:rPr>
-                <w:rFonts w:ascii="Times New Roman" w:eastAsia="Times New Roman" w:hAnsi="Times New Roman" w:cs="Times New Roman"/>
-                <w:sz w:val="20"/>
-                <w:szCs w:val="20"/>
-              </w:rPr>
-            </w:pPr>
-          </w:p>
-        </w:tc>
-        <w:tc>
-          <w:tcPr>
-            <w:tcW w:w="705" w:type="dxa"/>
-            <w:vAlign w:val="center"/>
-          </w:tcPr>
-          <w:p>
-            <w:pPr>
-              <w:spacing w:after="0" w:line="240" w:lineRule="auto"/>
-              <w:rPr>
-                <w:rFonts w:ascii="Times New Roman" w:eastAsia="Times New Roman" w:hAnsi="Times New Roman" w:cs="Times New Roman"/>
-                <w:sz w:val="20"/>
-                <w:szCs w:val="20"/>
-              </w:rPr>
-            </w:pPr>
-          </w:p>
-        </w:tc>
-        <w:tc>
-          <w:tcPr>
-            <w:tcW w:w="705" w:type="dxa"/>
-            <w:vAlign w:val="center"/>
-          </w:tcPr>
-          <w:p>
-            <w:pPr>
-              <w:spacing w:after="0" w:line="240" w:lineRule="auto"/>
-              <w:rPr>
-                <w:rFonts w:ascii="Times New Roman" w:eastAsia="Times New Roman" w:hAnsi="Times New Roman" w:cs="Times New Roman"/>
-                <w:sz w:val="20"/>
-                <w:szCs w:val="20"/>
-              </w:rPr>
-            </w:pPr>
-          </w:p>
-        </w:tc>
-        <w:tc>
-          <w:tcPr>
-            <w:tcW w:w="705" w:type="dxa"/>
-            <w:vAlign w:val="center"/>
-          </w:tcPr>
-          <w:p>
-            <w:pPr>
-              <w:spacing w:after="0" w:line="240" w:lineRule="auto"/>
-              <w:rPr>
-                <w:rFonts w:ascii="Times New Roman" w:eastAsia="Times New Roman" w:hAnsi="Times New Roman" w:cs="Times New Roman"/>
-                <w:sz w:val="20"/>
-                <w:szCs w:val="20"/>
-              </w:rPr>
-            </w:pPr>
-          </w:p>
-        </w:tc>
-        <w:tc>
-          <w:tcPr>
-            <w:tcW w:w="705" w:type="dxa"/>
-            <w:vAlign w:val="center"/>
-          </w:tcPr>
-          <w:p>
-            <w:pPr>
-              <w:spacing w:after="0" w:line="240" w:lineRule="auto"/>
+              <w:jc w:val="center"/>
               <w:rPr>
                 <w:rFonts w:ascii="Times New Roman" w:eastAsia="Times New Roman" w:hAnsi="Times New Roman" w:cs="Times New Roman"/>
                 <w:sz w:val="20"/>
@@ -1074,7 +1103,205 @@
                 <w:sz w:val="20"/>
                 <w:szCs w:val="20"/>
               </w:rPr>
-              <w:t>{/students}</w:t>
+              <w:t>{attendance</w:t>
+            </w:r>
+            <w:r>
+              <w:rPr>
+                <w:rFonts w:ascii="Times New Roman" w:eastAsia="Times New Roman" w:hAnsi="Times New Roman" w:cs="Times New Roman"/>
+                <w:sz w:val="20"/>
+                <w:szCs w:val="20"/>
+              </w:rPr>
+              <w:t>6</w:t>
+            </w:r>
+            <w:r>
+              <w:rPr>
+                <w:rFonts w:ascii="Times New Roman" w:eastAsia="Times New Roman" w:hAnsi="Times New Roman" w:cs="Times New Roman"/>
+                <w:sz w:val="20"/>
+                <w:szCs w:val="20"/>
+              </w:rPr>
+              <w:t>}</w:t>
+            </w:r>
+          </w:p>
+        </w:tc>
+        <w:tc>
+          <w:tcPr>
+            <w:tcW w:w="705" w:type="dxa"/>
+            <w:vAlign w:val="center"/>
+          </w:tcPr>
+          <w:p>
+            <w:pPr>
+              <w:spacing w:after="0" w:line="240" w:lineRule="auto"/>
+              <w:jc w:val="center"/>
+              <w:rPr>
+                <w:rFonts w:ascii="Times New Roman" w:eastAsia="Times New Roman" w:hAnsi="Times New Roman" w:cs="Times New Roman"/>
+                <w:sz w:val="20"/>
+                <w:szCs w:val="20"/>
+              </w:rPr>
+            </w:pPr>
+            <w:r>
+              <w:rPr>
+                <w:rFonts w:ascii="Times New Roman" w:eastAsia="Times New Roman" w:hAnsi="Times New Roman" w:cs="Times New Roman"/>
+                <w:sz w:val="20"/>
+                <w:szCs w:val="20"/>
+              </w:rPr>
+              <w:t>{attendance</w:t>
+            </w:r>
+            <w:r>
+              <w:rPr>
+                <w:rFonts w:ascii="Times New Roman" w:eastAsia="Times New Roman" w:hAnsi="Times New Roman" w:cs="Times New Roman"/>
+                <w:sz w:val="20"/>
+                <w:szCs w:val="20"/>
+              </w:rPr>
+              <w:t>7</w:t>
+            </w:r>
+            <w:r>
+              <w:rPr>
+                <w:rFonts w:ascii="Times New Roman" w:eastAsia="Times New Roman" w:hAnsi="Times New Roman" w:cs="Times New Roman"/>
+                <w:sz w:val="20"/>
+                <w:szCs w:val="20"/>
+              </w:rPr>
+              <w:t>}</w:t>
+            </w:r>
+          </w:p>
+        </w:tc>
+        <w:tc>
+          <w:tcPr>
+            <w:tcW w:w="705" w:type="dxa"/>
+            <w:vAlign w:val="center"/>
+          </w:tcPr>
+          <w:p>
+            <w:pPr>
+              <w:spacing w:after="0" w:line="240" w:lineRule="auto"/>
+              <w:jc w:val="center"/>
+              <w:rPr>
+                <w:rFonts w:ascii="Times New Roman" w:eastAsia="Times New Roman" w:hAnsi="Times New Roman" w:cs="Times New Roman"/>
+                <w:sz w:val="20"/>
+                <w:szCs w:val="20"/>
+              </w:rPr>
+            </w:pPr>
+            <w:r>
+              <w:rPr>
+                <w:rFonts w:ascii="Times New Roman" w:eastAsia="Times New Roman" w:hAnsi="Times New Roman" w:cs="Times New Roman"/>
+                <w:sz w:val="20"/>
+                <w:szCs w:val="20"/>
+              </w:rPr>
+              <w:t>{attendance</w:t>
+            </w:r>
+            <w:r>
+              <w:rPr>
+                <w:rFonts w:ascii="Times New Roman" w:eastAsia="Times New Roman" w:hAnsi="Times New Roman" w:cs="Times New Roman"/>
+                <w:sz w:val="20"/>
+                <w:szCs w:val="20"/>
+              </w:rPr>
+              <w:t>8</w:t>
+            </w:r>
+            <w:r>
+              <w:rPr>
+                <w:rFonts w:ascii="Times New Roman" w:eastAsia="Times New Roman" w:hAnsi="Times New Roman" w:cs="Times New Roman"/>
+                <w:sz w:val="20"/>
+                <w:szCs w:val="20"/>
+              </w:rPr>
+              <w:t>}</w:t>
+            </w:r>
+          </w:p>
+        </w:tc>
+        <w:tc>
+          <w:tcPr>
+            <w:tcW w:w="705" w:type="dxa"/>
+            <w:vAlign w:val="center"/>
+          </w:tcPr>
+          <w:p>
+            <w:pPr>
+              <w:spacing w:after="0" w:line="240" w:lineRule="auto"/>
+              <w:jc w:val="center"/>
+              <w:rPr>
+                <w:rFonts w:ascii="Times New Roman" w:eastAsia="Times New Roman" w:hAnsi="Times New Roman" w:cs="Times New Roman"/>
+                <w:sz w:val="20"/>
+                <w:szCs w:val="20"/>
+              </w:rPr>
+            </w:pPr>
+            <w:r>
+              <w:rPr>
+                <w:rFonts w:ascii="Times New Roman" w:eastAsia="Times New Roman" w:hAnsi="Times New Roman" w:cs="Times New Roman"/>
+                <w:sz w:val="20"/>
+                <w:szCs w:val="20"/>
+              </w:rPr>
+              <w:t>{attendance</w:t>
+            </w:r>
+            <w:r>
+              <w:rPr>
+                <w:rFonts w:ascii="Times New Roman" w:eastAsia="Times New Roman" w:hAnsi="Times New Roman" w:cs="Times New Roman"/>
+                <w:sz w:val="20"/>
+                <w:szCs w:val="20"/>
+              </w:rPr>
+              <w:t>9</w:t>
+            </w:r>
+            <w:r>
+              <w:rPr>
+                <w:rFonts w:ascii="Times New Roman" w:eastAsia="Times New Roman" w:hAnsi="Times New Roman" w:cs="Times New Roman"/>
+                <w:sz w:val="20"/>
+                <w:szCs w:val="20"/>
+              </w:rPr>
+              <w:t>}</w:t>
+            </w:r>
+          </w:p>
+        </w:tc>
+        <w:tc>
+          <w:tcPr>
+            <w:tcW w:w="705" w:type="dxa"/>
+            <w:vAlign w:val="center"/>
+          </w:tcPr>
+          <w:p>
+            <w:pPr>
+              <w:spacing w:after="0" w:line="240" w:lineRule="auto"/>
+              <w:jc w:val="center"/>
+              <w:rPr>
+                <w:rFonts w:ascii="Times New Roman" w:eastAsia="Times New Roman" w:hAnsi="Times New Roman" w:cs="Times New Roman"/>
+                <w:sz w:val="20"/>
+                <w:szCs w:val="20"/>
+              </w:rPr>
+            </w:pPr>
+            <w:r>
+              <w:rPr>
+                <w:rFonts w:ascii="Times New Roman" w:eastAsia="Times New Roman" w:hAnsi="Times New Roman" w:cs="Times New Roman"/>
+                <w:sz w:val="20"/>
+                <w:szCs w:val="20"/>
+              </w:rPr>
+              <w:t>{attendance</w:t>
+            </w:r>
+            <w:proofErr w:type="gramStart"/>
+            <w:r>
+              <w:rPr>
+                <w:rFonts w:ascii="Times New Roman" w:eastAsia="Times New Roman" w:hAnsi="Times New Roman" w:cs="Times New Roman"/>
+                <w:sz w:val="20"/>
+                <w:szCs w:val="20"/>
+              </w:rPr>
+              <w:t>10</w:t>
+            </w:r>
+            <w:r>
+              <w:rPr>
+                <w:rFonts w:ascii="Times New Roman" w:eastAsia="Times New Roman" w:hAnsi="Times New Roman" w:cs="Times New Roman"/>
+                <w:sz w:val="20"/>
+                <w:szCs w:val="20"/>
+              </w:rPr>
+              <w:t>}</w:t>
+            </w:r>
+            <w:r>
+              <w:rPr>
+                <w:rFonts w:ascii="Times New Roman" w:eastAsia="Times New Roman" w:hAnsi="Times New Roman" w:cs="Times New Roman"/>
+                <w:sz w:val="20"/>
+                <w:szCs w:val="20"/>
+              </w:rPr>
+              <w:t>{</w:t>
+            </w:r>
+            <w:proofErr w:type="gramEnd"/>
+            <w:r>
+              <w:rPr>
+                <w:rFonts w:ascii="Times New Roman" w:eastAsia="Times New Roman" w:hAnsi="Times New Roman" w:cs="Times New Roman"/>
+                <w:sz w:val="20"/>
+                <w:szCs w:val="20"/>
+              </w:rPr>
+              <w:t>/students}</w:t>
             </w:r>
           </w:p>
         </w:tc>
@@ -11423,7 +11650,6 @@
   <w:style w:type="character" w:default="1" w:styleId="DefaultParagraphFont">
     <w:name w:val="Default Paragraph Font"/>
     <w:uiPriority w:val="1"/>
-    <w:semiHidden/>
     <w:unhideWhenUsed/>
   </w:style>
   <w:style w:type="table" w:default="1" w:styleId="TableNormal">

</xml_diff>